<commit_message>
ISEF 2nd Stage Commit
</commit_message>
<xml_diff>
--- a/Documents/WattWizards - ISEF 2025 - Abstract.docx
+++ b/Documents/WattWizards - ISEF 2025 - Abstract.docx
@@ -13,6 +13,7 @@
           <w:szCs w:val="36"/>
         </w:rPr>
       </w:pPr>
+      <w:bookmarkStart w:id="0" w:name="_GoBack"/>
       <w:r>
         <w:rPr>
           <w:rFonts w:ascii="Times New Roman" w:hAnsi="Times New Roman" w:cs="Times New Roman"/>
@@ -45,10 +46,7 @@
         </w:rPr>
         <w:t>Under the supervision of Engineer Muhammed Rushdy</w:t>
       </w:r>
-    </w:p>
-    <w:p>
-      <w:pPr>
-        <w:jc w:val="center"/>
+      <w:r>
         <w:rPr>
           <w:rFonts w:ascii="Times New Roman" w:hAnsi="Times New Roman" w:cs="Times New Roman"/>
           <w:b/>
@@ -56,8 +54,12 @@
           <w:sz w:val="36"/>
           <w:szCs w:val="36"/>
         </w:rPr>
-      </w:pPr>
-      <w:r>
+        <w:t xml:space="preserve"> / Mr. Sherief Ragab</w:t>
+      </w:r>
+    </w:p>
+    <w:p>
+      <w:pPr>
+        <w:jc w:val="center"/>
         <w:rPr>
           <w:rFonts w:ascii="Times New Roman" w:hAnsi="Times New Roman" w:cs="Times New Roman"/>
           <w:b/>
@@ -65,6 +67,15 @@
           <w:sz w:val="36"/>
           <w:szCs w:val="36"/>
         </w:rPr>
+      </w:pPr>
+      <w:r>
+        <w:rPr>
+          <w:rFonts w:ascii="Times New Roman" w:hAnsi="Times New Roman" w:cs="Times New Roman"/>
+          <w:b/>
+          <w:bCs/>
+          <w:sz w:val="36"/>
+          <w:szCs w:val="36"/>
+        </w:rPr>
         <w:t>Authors: Ahmed Medhat – Loucas Monir</w:t>
       </w:r>
     </w:p>
@@ -109,17 +120,7 @@
           <w:sz w:val="28"/>
           <w:szCs w:val="28"/>
         </w:rPr>
-        <w:t xml:space="preserve">Electrical engineers and technicians often encounter challenges with calculation accuracy and efficiency in factory and workshop settings. Our research aimed to address these issues by developing a web and mobile application to facilitate electrical circuit analysis and related calculations. The tool significantly reduces errors, saves time, and ensures reliable results, as confirmed by positive feedback from technicians. This innovation is not only a practical solution </w:t>
-      </w:r>
-      <w:bookmarkStart w:id="0" w:name="_GoBack"/>
-      <w:bookmarkEnd w:id="0"/>
-      <w:r>
-        <w:rPr>
-          <w:rFonts w:ascii="Times New Roman" w:eastAsia="Times New Roman" w:hAnsi="Times New Roman" w:cs="Times New Roman"/>
-          <w:sz w:val="28"/>
-          <w:szCs w:val="28"/>
-        </w:rPr>
-        <w:t>but also accelerates workflows, making it essential for professionals in the field.</w:t>
+        <w:t>Electrical engineers and technicians often encounter challenges with calculation accuracy and efficiency in factory and workshop settings. Our research aimed to address these issues by developing a web and mobile application to facilitate electrical circuit analysis and related calculations. The tool significantly reduces errors, saves time, and ensures reliable results, as confirmed by positive feedback from technicians. This innovation is not only a practical solution but also accelerates workflows, making it essential for professionals in the field.</w:t>
       </w:r>
     </w:p>
     <w:p>
@@ -148,8 +149,61 @@
           <w:sz w:val="32"/>
           <w:szCs w:val="32"/>
         </w:rPr>
-        <w:t>Procedures</w:t>
-      </w:r>
+        <w:t xml:space="preserve">Procedures: </w:t>
+      </w:r>
+    </w:p>
+    <w:p>
+      <w:pPr>
+        <w:spacing w:before="100" w:beforeAutospacing="1" w:after="100" w:afterAutospacing="1" w:line="240" w:lineRule="auto"/>
+        <w:rPr>
+          <w:rFonts w:ascii="Times New Roman" w:eastAsia="Times New Roman" w:hAnsi="Times New Roman" w:cs="Times New Roman"/>
+          <w:sz w:val="28"/>
+          <w:szCs w:val="28"/>
+        </w:rPr>
+      </w:pPr>
+      <w:r>
+        <w:rPr>
+          <w:rFonts w:ascii="Times New Roman" w:eastAsia="Times New Roman" w:hAnsi="Times New Roman" w:cs="Times New Roman"/>
+          <w:sz w:val="28"/>
+          <w:szCs w:val="28"/>
+        </w:rPr>
+        <w:t>The project underwent a multi-stage development process. Initially, an Excel sheet was utilized for calculations; however, its limitations in handling complex computations prompted the transition to a Python-based desktop application. This application featured a simple GUI built with the CustomTkinter module. Subsequently, the project evolved into a web application leveraging frontend technologies such as HTML5, CSS3, and JavaScript. The final stage involved developing a React.js-based web app, incorporating TypeScript, Node.js,</w:t>
+      </w:r>
+      <w:r>
+        <w:rPr>
+          <w:rFonts w:ascii="Times New Roman" w:eastAsia="Times New Roman" w:hAnsi="Times New Roman" w:cs="Times New Roman"/>
+          <w:sz w:val="28"/>
+          <w:szCs w:val="28"/>
+        </w:rPr>
+        <w:t xml:space="preserve"> Express.js,</w:t>
+      </w:r>
+      <w:r>
+        <w:rPr>
+          <w:rFonts w:ascii="Times New Roman" w:eastAsia="Times New Roman" w:hAnsi="Times New Roman" w:cs="Times New Roman"/>
+          <w:sz w:val="28"/>
+          <w:szCs w:val="28"/>
+        </w:rPr>
+        <w:t xml:space="preserve"> PHP, Laravel, and MySQL to enhance flexibility and support modifications.</w:t>
+      </w:r>
+    </w:p>
+    <w:p>
+      <w:pPr>
+        <w:spacing w:before="100" w:beforeAutospacing="1" w:after="100" w:afterAutospacing="1" w:line="240" w:lineRule="auto"/>
+        <w:rPr>
+          <w:rFonts w:ascii="Times New Roman" w:eastAsia="Times New Roman" w:hAnsi="Times New Roman" w:cs="Times New Roman"/>
+          <w:sz w:val="24"/>
+          <w:szCs w:val="24"/>
+        </w:rPr>
+      </w:pPr>
+    </w:p>
+    <w:p>
+      <w:pPr>
+        <w:rPr>
+          <w:rFonts w:ascii="Times New Roman" w:hAnsi="Times New Roman" w:cs="Times New Roman"/>
+          <w:b/>
+          <w:bCs/>
+        </w:rPr>
+      </w:pPr>
       <w:r>
         <w:rPr>
           <w:rFonts w:ascii="Times New Roman" w:hAnsi="Times New Roman" w:cs="Times New Roman"/>
@@ -158,64 +212,7 @@
           <w:sz w:val="32"/>
           <w:szCs w:val="32"/>
         </w:rPr>
-        <w:t xml:space="preserve">: </w:t>
-      </w:r>
-    </w:p>
-    <w:p>
-      <w:pPr>
-        <w:spacing w:before="100" w:beforeAutospacing="1" w:after="100" w:afterAutospacing="1" w:line="240" w:lineRule="auto"/>
-        <w:rPr>
-          <w:rFonts w:ascii="Times New Roman" w:eastAsia="Times New Roman" w:hAnsi="Times New Roman" w:cs="Times New Roman"/>
-          <w:sz w:val="28"/>
-          <w:szCs w:val="28"/>
-        </w:rPr>
-      </w:pPr>
-      <w:r>
-        <w:rPr>
-          <w:rFonts w:ascii="Times New Roman" w:eastAsia="Times New Roman" w:hAnsi="Times New Roman" w:cs="Times New Roman"/>
-          <w:sz w:val="28"/>
-          <w:szCs w:val="28"/>
-        </w:rPr>
-        <w:t>The project underwent a multi-stage development process. Initially, an Excel sheet was utilized for calculations; however, its limitations in handling complex computations prompted the transition to a Python-based desktop application. This application featured a simple GUI built with the CustomTkinter module. Subsequently, the project evolved into a web application leveraging frontend technologies such as HTML5, CSS3, and JavaScript. The final stage involved developing a React.js-based web app, incorporating TypeScript, Node.js, PHP, Laravel, and MySQL to enhance flexibility and support modifications.</w:t>
-      </w:r>
-    </w:p>
-    <w:p>
-      <w:pPr>
-        <w:spacing w:before="100" w:beforeAutospacing="1" w:after="100" w:afterAutospacing="1" w:line="240" w:lineRule="auto"/>
-        <w:rPr>
-          <w:rFonts w:ascii="Times New Roman" w:eastAsia="Times New Roman" w:hAnsi="Times New Roman" w:cs="Times New Roman"/>
-          <w:sz w:val="24"/>
-          <w:szCs w:val="24"/>
-        </w:rPr>
-      </w:pPr>
-    </w:p>
-    <w:p>
-      <w:pPr>
-        <w:rPr>
-          <w:rFonts w:ascii="Times New Roman" w:hAnsi="Times New Roman" w:cs="Times New Roman"/>
-          <w:b/>
-          <w:bCs/>
-        </w:rPr>
-      </w:pPr>
-      <w:r>
-        <w:rPr>
-          <w:rFonts w:ascii="Times New Roman" w:hAnsi="Times New Roman" w:cs="Times New Roman"/>
-          <w:b/>
-          <w:bCs/>
-          <w:sz w:val="32"/>
-          <w:szCs w:val="32"/>
-        </w:rPr>
-        <w:t>Data Analysis</w:t>
-      </w:r>
-      <w:r>
-        <w:rPr>
-          <w:rFonts w:ascii="Times New Roman" w:hAnsi="Times New Roman" w:cs="Times New Roman"/>
-          <w:b/>
-          <w:bCs/>
-          <w:sz w:val="32"/>
-          <w:szCs w:val="32"/>
-        </w:rPr>
-        <w:t xml:space="preserve">: </w:t>
+        <w:t xml:space="preserve">Data Analysis: </w:t>
       </w:r>
     </w:p>
     <w:p>
@@ -392,6 +389,7 @@
       </w:r>
     </w:p>
     <w:p/>
+    <w:bookmarkEnd w:id="0"/>
     <w:p/>
     <w:sectPr>
       <w:pgSz w:w="12240" w:h="15840"/>

</xml_diff>

<commit_message>
BASEF Frontend 3rd Commit
</commit_message>
<xml_diff>
--- a/Documents/WattWizards - ISEF 2025 - Abstract.docx
+++ b/Documents/WattWizards - ISEF 2025 - Abstract.docx
@@ -4,393 +4,371 @@
   <w:body>
     <w:p>
       <w:pPr>
+        <w:spacing w:before="100" w:beforeAutospacing="1" w:after="100" w:afterAutospacing="1" w:line="240" w:lineRule="auto"/>
         <w:jc w:val="center"/>
         <w:rPr>
-          <w:rFonts w:ascii="Times New Roman" w:hAnsi="Times New Roman" w:cs="Times New Roman"/>
+          <w:rFonts w:ascii="Times New Roman" w:eastAsia="Times New Roman" w:hAnsi="Times New Roman" w:cs="Times New Roman"/>
+          <w:sz w:val="36"/>
+          <w:szCs w:val="36"/>
+        </w:rPr>
+      </w:pPr>
+      <w:r>
+        <w:rPr>
+          <w:rFonts w:ascii="Times New Roman" w:eastAsia="Times New Roman" w:hAnsi="Times New Roman" w:cs="Times New Roman"/>
           <w:b/>
           <w:bCs/>
           <w:sz w:val="36"/>
           <w:szCs w:val="36"/>
         </w:rPr>
-      </w:pPr>
-      <w:bookmarkStart w:id="0" w:name="_GoBack"/>
-      <w:r>
-        <w:rPr>
-          <w:rFonts w:ascii="Times New Roman" w:hAnsi="Times New Roman" w:cs="Times New Roman"/>
+        <w:t>Project Title:</w:t>
+      </w:r>
+      <w:r>
+        <w:rPr>
+          <w:rFonts w:ascii="Times New Roman" w:eastAsia="Times New Roman" w:hAnsi="Times New Roman" w:cs="Times New Roman"/>
+          <w:sz w:val="36"/>
+          <w:szCs w:val="36"/>
+        </w:rPr>
+        <w:t xml:space="preserve"> WattWizards</w:t>
+      </w:r>
+      <w:r>
+        <w:rPr>
+          <w:rFonts w:ascii="Times New Roman" w:eastAsia="Times New Roman" w:hAnsi="Times New Roman" w:cs="Times New Roman"/>
+          <w:sz w:val="36"/>
+          <w:szCs w:val="36"/>
+        </w:rPr>
+        <w:br/>
+      </w:r>
+      <w:r>
+        <w:rPr>
+          <w:rFonts w:ascii="Times New Roman" w:eastAsia="Times New Roman" w:hAnsi="Times New Roman" w:cs="Times New Roman"/>
           <w:b/>
           <w:bCs/>
           <w:sz w:val="36"/>
           <w:szCs w:val="36"/>
         </w:rPr>
-        <w:t>Project Title: WattWizards</w:t>
-      </w:r>
-    </w:p>
-    <w:p>
-      <w:pPr>
-        <w:jc w:val="center"/>
-        <w:rPr>
-          <w:rFonts w:ascii="Times New Roman" w:hAnsi="Times New Roman" w:cs="Times New Roman"/>
+        <w:t>Under the supervision of:</w:t>
+      </w:r>
+      <w:r>
+        <w:rPr>
+          <w:rFonts w:ascii="Times New Roman" w:eastAsia="Times New Roman" w:hAnsi="Times New Roman" w:cs="Times New Roman"/>
+          <w:sz w:val="36"/>
+          <w:szCs w:val="36"/>
+        </w:rPr>
+        <w:t xml:space="preserve"> Engineer Muhammed Rushdy / Mr. Sherief Ragab</w:t>
+      </w:r>
+      <w:r>
+        <w:rPr>
+          <w:rFonts w:ascii="Times New Roman" w:eastAsia="Times New Roman" w:hAnsi="Times New Roman" w:cs="Times New Roman"/>
+          <w:sz w:val="36"/>
+          <w:szCs w:val="36"/>
+        </w:rPr>
+        <w:br/>
+      </w:r>
+      <w:r>
+        <w:rPr>
+          <w:rFonts w:ascii="Times New Roman" w:eastAsia="Times New Roman" w:hAnsi="Times New Roman" w:cs="Times New Roman"/>
           <w:b/>
           <w:bCs/>
           <w:sz w:val="36"/>
           <w:szCs w:val="36"/>
         </w:rPr>
-      </w:pPr>
-      <w:r>
-        <w:rPr>
-          <w:rFonts w:ascii="Times New Roman" w:hAnsi="Times New Roman" w:cs="Times New Roman"/>
+        <w:t>Authors:</w:t>
+      </w:r>
+      <w:r>
+        <w:rPr>
+          <w:rFonts w:ascii="Times New Roman" w:eastAsia="Times New Roman" w:hAnsi="Times New Roman" w:cs="Times New Roman"/>
+          <w:sz w:val="36"/>
+          <w:szCs w:val="36"/>
+        </w:rPr>
+        <w:t xml:space="preserve"> Ahmed Medhat – Loucas Monir</w:t>
+      </w:r>
+    </w:p>
+    <w:p>
+      <w:pPr>
+        <w:spacing w:before="100" w:beforeAutospacing="1" w:after="100" w:afterAutospacing="1" w:line="240" w:lineRule="auto"/>
+        <w:rPr>
+          <w:rFonts w:ascii="Times New Roman" w:eastAsia="Times New Roman" w:hAnsi="Times New Roman" w:cs="Times New Roman"/>
+          <w:sz w:val="32"/>
+          <w:szCs w:val="32"/>
+        </w:rPr>
+      </w:pPr>
+      <w:r>
+        <w:rPr>
+          <w:rFonts w:ascii="Times New Roman" w:eastAsia="Times New Roman" w:hAnsi="Times New Roman" w:cs="Times New Roman"/>
           <w:b/>
           <w:bCs/>
-          <w:sz w:val="36"/>
-          <w:szCs w:val="36"/>
-        </w:rPr>
-        <w:t>Under the supervision of Engineer Muhammed Rushdy</w:t>
-      </w:r>
-      <w:r>
-        <w:rPr>
-          <w:rFonts w:ascii="Times New Roman" w:hAnsi="Times New Roman" w:cs="Times New Roman"/>
+          <w:sz w:val="32"/>
+          <w:szCs w:val="32"/>
+        </w:rPr>
+        <w:t>Introduction:</w:t>
+      </w:r>
+      <w:r>
+        <w:rPr>
+          <w:rFonts w:ascii="Times New Roman" w:eastAsia="Times New Roman" w:hAnsi="Times New Roman" w:cs="Times New Roman"/>
+          <w:sz w:val="32"/>
+          <w:szCs w:val="32"/>
+        </w:rPr>
+        <w:br/>
+        <w:t xml:space="preserve">Electrical engineers and technicians often face challenges in achieving precision and efficiency in calculations, particularly in industrial settings. This research introduces </w:t>
+      </w:r>
+      <w:r>
+        <w:rPr>
+          <w:rFonts w:ascii="Times New Roman" w:eastAsia="Times New Roman" w:hAnsi="Times New Roman" w:cs="Times New Roman"/>
           <w:b/>
           <w:bCs/>
-          <w:sz w:val="36"/>
-          <w:szCs w:val="36"/>
-        </w:rPr>
-        <w:t xml:space="preserve"> / Mr. Sherief Ragab</w:t>
+          <w:sz w:val="32"/>
+          <w:szCs w:val="32"/>
+        </w:rPr>
+        <w:t>WattWizards</w:t>
+      </w:r>
+      <w:r>
+        <w:rPr>
+          <w:rFonts w:ascii="Times New Roman" w:eastAsia="Times New Roman" w:hAnsi="Times New Roman" w:cs="Times New Roman"/>
+          <w:sz w:val="32"/>
+          <w:szCs w:val="32"/>
+        </w:rPr>
+        <w:t>, a software platform designed to streamline electrical circuit analysis and computations. The application</w:t>
+      </w:r>
+      <w:r>
+        <w:rPr>
+          <w:rFonts w:ascii="Times New Roman" w:eastAsia="Times New Roman" w:hAnsi="Times New Roman" w:cs="Times New Roman"/>
+          <w:sz w:val="32"/>
+          <w:szCs w:val="32"/>
+        </w:rPr>
+        <w:t xml:space="preserve"> reduces errors,</w:t>
+      </w:r>
+      <w:r>
+        <w:rPr>
+          <w:rFonts w:ascii="Times New Roman" w:eastAsia="Times New Roman" w:hAnsi="Times New Roman" w:cs="Times New Roman"/>
+          <w:sz w:val="32"/>
+          <w:szCs w:val="32"/>
+        </w:rPr>
+        <w:t xml:space="preserve"> and incorporates features like workspaces and inventory management. </w:t>
       </w:r>
     </w:p>
     <w:p>
       <w:pPr>
-        <w:jc w:val="center"/>
-        <w:rPr>
-          <w:rFonts w:ascii="Times New Roman" w:hAnsi="Times New Roman" w:cs="Times New Roman"/>
+        <w:spacing w:before="100" w:beforeAutospacing="1" w:after="100" w:afterAutospacing="1" w:line="240" w:lineRule="auto"/>
+        <w:rPr>
+          <w:rFonts w:ascii="Times New Roman" w:eastAsia="Times New Roman" w:hAnsi="Times New Roman" w:cs="Times New Roman"/>
+          <w:sz w:val="32"/>
+          <w:szCs w:val="32"/>
+        </w:rPr>
+      </w:pPr>
+      <w:r>
+        <w:rPr>
+          <w:rFonts w:ascii="Times New Roman" w:eastAsia="Times New Roman" w:hAnsi="Times New Roman" w:cs="Times New Roman"/>
           <w:b/>
           <w:bCs/>
-          <w:sz w:val="36"/>
-          <w:szCs w:val="36"/>
-        </w:rPr>
-      </w:pPr>
-      <w:r>
-        <w:rPr>
-          <w:rFonts w:ascii="Times New Roman" w:hAnsi="Times New Roman" w:cs="Times New Roman"/>
+          <w:sz w:val="32"/>
+          <w:szCs w:val="32"/>
+        </w:rPr>
+        <w:t>Procedures:</w:t>
+      </w:r>
+      <w:r>
+        <w:rPr>
+          <w:rFonts w:ascii="Times New Roman" w:eastAsia="Times New Roman" w:hAnsi="Times New Roman" w:cs="Times New Roman"/>
+          <w:sz w:val="32"/>
+          <w:szCs w:val="32"/>
+        </w:rPr>
+        <w:br/>
+      </w:r>
+      <w:r>
+        <w:rPr>
+          <w:rFonts w:ascii="Times New Roman" w:eastAsia="Times New Roman" w:hAnsi="Times New Roman" w:cs="Times New Roman"/>
+          <w:sz w:val="32"/>
+          <w:szCs w:val="32"/>
+        </w:rPr>
+        <w:t>The development of WattWizards followed a structured multi-phase approach. Initially, an Excel-based tool was employed but proved inadequate for complex tasks, prompting the creation of a Python desktop application with a GUI using CustomTkinter. To improve scalability and user accessibility, the project transitioned to a web application utilizing Html5, Css3, and JavaScript.</w:t>
+      </w:r>
+    </w:p>
+    <w:p>
+      <w:pPr>
+        <w:spacing w:before="100" w:beforeAutospacing="1" w:after="100" w:afterAutospacing="1" w:line="240" w:lineRule="auto"/>
+        <w:rPr>
+          <w:rFonts w:ascii="Times New Roman" w:eastAsia="Times New Roman" w:hAnsi="Times New Roman" w:cs="Times New Roman"/>
+          <w:sz w:val="32"/>
+          <w:szCs w:val="32"/>
+        </w:rPr>
+      </w:pPr>
+      <w:r>
+        <w:rPr>
+          <w:rFonts w:ascii="Times New Roman" w:eastAsia="Times New Roman" w:hAnsi="Times New Roman" w:cs="Times New Roman"/>
+          <w:sz w:val="32"/>
+          <w:szCs w:val="32"/>
+        </w:rPr>
+        <w:t>The final iteration was developed as a React.js platform integrated with Node.js, Express.js, PHP, and Laravel for microservices and backend improvements. MySQL ensured efficient data handling.</w:t>
+      </w:r>
+      <w:bookmarkStart w:id="0" w:name="_GoBack"/>
+      <w:bookmarkEnd w:id="0"/>
+    </w:p>
+    <w:p>
+      <w:pPr>
+        <w:spacing w:before="100" w:beforeAutospacing="1" w:after="100" w:afterAutospacing="1" w:line="240" w:lineRule="auto"/>
+        <w:rPr>
+          <w:rFonts w:ascii="Times New Roman" w:eastAsia="Times New Roman" w:hAnsi="Times New Roman" w:cs="Times New Roman"/>
+          <w:sz w:val="32"/>
+          <w:szCs w:val="32"/>
+        </w:rPr>
+      </w:pPr>
+      <w:r>
+        <w:rPr>
+          <w:rFonts w:ascii="Times New Roman" w:eastAsia="Times New Roman" w:hAnsi="Times New Roman" w:cs="Times New Roman"/>
           <w:b/>
           <w:bCs/>
-          <w:sz w:val="36"/>
-          <w:szCs w:val="36"/>
-        </w:rPr>
-        <w:t>Authors: Ahmed Medhat – Loucas Monir</w:t>
+          <w:sz w:val="32"/>
+          <w:szCs w:val="32"/>
+        </w:rPr>
+        <w:t>Data Analysis:</w:t>
+      </w:r>
+      <w:r>
+        <w:rPr>
+          <w:rFonts w:ascii="Times New Roman" w:eastAsia="Times New Roman" w:hAnsi="Times New Roman" w:cs="Times New Roman"/>
+          <w:sz w:val="32"/>
+          <w:szCs w:val="32"/>
+        </w:rPr>
+        <w:br/>
+        <w:t>Surveys revealed a strong demand for an accurate, user-friendly tool, guiding the platform’s design. WattWizards demonstrates potential to revolutionize workflows in industrial and educational applications.</w:t>
       </w:r>
     </w:p>
     <w:p>
       <w:pPr>
-        <w:rPr>
-          <w:rFonts w:ascii="Times New Roman" w:hAnsi="Times New Roman" w:cs="Times New Roman"/>
-        </w:rPr>
-      </w:pPr>
+        <w:spacing w:before="100" w:beforeAutospacing="1" w:after="100" w:afterAutospacing="1" w:line="240" w:lineRule="auto"/>
+        <w:rPr>
+          <w:rFonts w:ascii="Times New Roman" w:eastAsia="Times New Roman" w:hAnsi="Times New Roman" w:cs="Times New Roman"/>
+          <w:sz w:val="32"/>
+          <w:szCs w:val="32"/>
+        </w:rPr>
+      </w:pPr>
+      <w:r>
+        <w:rPr>
+          <w:rFonts w:ascii="Times New Roman" w:eastAsia="Times New Roman" w:hAnsi="Times New Roman" w:cs="Times New Roman"/>
+          <w:b/>
+          <w:bCs/>
+          <w:sz w:val="32"/>
+          <w:szCs w:val="32"/>
+        </w:rPr>
+        <w:t>References:</w:t>
+      </w:r>
     </w:p>
     <w:p>
       <w:pPr>
-        <w:rPr>
-          <w:rFonts w:ascii="Times New Roman" w:hAnsi="Times New Roman" w:cs="Times New Roman"/>
+        <w:numPr>
+          <w:ilvl w:val="0"/>
+          <w:numId w:val="4"/>
+        </w:numPr>
+        <w:spacing w:before="100" w:beforeAutospacing="1" w:after="100" w:afterAutospacing="1" w:line="240" w:lineRule="auto"/>
+        <w:rPr>
+          <w:rFonts w:ascii="Times New Roman" w:eastAsia="Times New Roman" w:hAnsi="Times New Roman" w:cs="Times New Roman"/>
           <w:b/>
           <w:bCs/>
-        </w:rPr>
-      </w:pPr>
-      <w:r>
-        <w:rPr>
-          <w:rFonts w:ascii="Times New Roman" w:hAnsi="Times New Roman" w:cs="Times New Roman"/>
+          <w:sz w:val="32"/>
+          <w:szCs w:val="32"/>
+        </w:rPr>
+      </w:pPr>
+      <w:r>
+        <w:rPr>
+          <w:rFonts w:ascii="Times New Roman" w:eastAsia="Times New Roman" w:hAnsi="Times New Roman" w:cs="Times New Roman"/>
           <w:b/>
           <w:bCs/>
           <w:sz w:val="32"/>
           <w:szCs w:val="32"/>
         </w:rPr>
-        <w:t xml:space="preserve">Introduction: </w:t>
+        <w:t>Power Factor Correction Solutions - IEEE Organization.</w:t>
       </w:r>
     </w:p>
     <w:p>
       <w:pPr>
+        <w:numPr>
+          <w:ilvl w:val="0"/>
+          <w:numId w:val="4"/>
+        </w:numPr>
         <w:spacing w:before="100" w:beforeAutospacing="1" w:after="100" w:afterAutospacing="1" w:line="240" w:lineRule="auto"/>
         <w:rPr>
           <w:rFonts w:ascii="Times New Roman" w:eastAsia="Times New Roman" w:hAnsi="Times New Roman" w:cs="Times New Roman"/>
-          <w:sz w:val="28"/>
-          <w:szCs w:val="28"/>
-        </w:rPr>
-      </w:pPr>
-      <w:r>
-        <w:rPr>
-          <w:rFonts w:ascii="Times New Roman" w:eastAsia="Times New Roman" w:hAnsi="Times New Roman" w:cs="Times New Roman"/>
-          <w:sz w:val="28"/>
-          <w:szCs w:val="28"/>
-        </w:rPr>
-        <w:t>Electrical engineers and technicians often encounter challenges with calculation accuracy and efficiency in factory and workshop settings. Our research aimed to address these issues by developing a web and mobile application to facilitate electrical circuit analysis and related calculations. The tool significantly reduces errors, saves time, and ensures reliable results, as confirmed by positive feedback from technicians. This innovation is not only a practical solution but also accelerates workflows, making it essential for professionals in the field.</w:t>
+          <w:b/>
+          <w:bCs/>
+          <w:sz w:val="32"/>
+          <w:szCs w:val="32"/>
+        </w:rPr>
+      </w:pPr>
+      <w:r>
+        <w:rPr>
+          <w:rFonts w:ascii="Times New Roman" w:eastAsia="Times New Roman" w:hAnsi="Times New Roman" w:cs="Times New Roman"/>
+          <w:b/>
+          <w:bCs/>
+          <w:sz w:val="32"/>
+          <w:szCs w:val="32"/>
+        </w:rPr>
+        <w:t>Conversion of Electrical Units - Iowa State University.</w:t>
       </w:r>
     </w:p>
     <w:p>
       <w:pPr>
+        <w:numPr>
+          <w:ilvl w:val="0"/>
+          <w:numId w:val="4"/>
+        </w:numPr>
         <w:spacing w:before="100" w:beforeAutospacing="1" w:after="100" w:afterAutospacing="1" w:line="240" w:lineRule="auto"/>
         <w:rPr>
           <w:rFonts w:ascii="Times New Roman" w:eastAsia="Times New Roman" w:hAnsi="Times New Roman" w:cs="Times New Roman"/>
-          <w:sz w:val="24"/>
-          <w:szCs w:val="24"/>
-        </w:rPr>
-      </w:pPr>
+          <w:b/>
+          <w:bCs/>
+          <w:sz w:val="32"/>
+          <w:szCs w:val="32"/>
+        </w:rPr>
+      </w:pPr>
+      <w:r>
+        <w:rPr>
+          <w:rFonts w:ascii="Times New Roman" w:eastAsia="Times New Roman" w:hAnsi="Times New Roman" w:cs="Times New Roman"/>
+          <w:b/>
+          <w:bCs/>
+          <w:sz w:val="32"/>
+          <w:szCs w:val="32"/>
+        </w:rPr>
+        <w:t>Electricity and Magnetism Equation Sheet - UT Dallas.</w:t>
+      </w:r>
     </w:p>
     <w:p>
       <w:pPr>
-        <w:rPr>
-          <w:rFonts w:ascii="Times New Roman" w:hAnsi="Times New Roman" w:cs="Times New Roman"/>
-          <w:b/>
-          <w:bCs/>
-        </w:rPr>
-      </w:pPr>
-      <w:r>
-        <w:rPr>
-          <w:rFonts w:ascii="Times New Roman" w:hAnsi="Times New Roman" w:cs="Times New Roman"/>
-          <w:b/>
-          <w:bCs/>
-          <w:sz w:val="32"/>
-          <w:szCs w:val="32"/>
-        </w:rPr>
-        <w:t xml:space="preserve">Procedures: </w:t>
-      </w:r>
-    </w:p>
-    <w:p>
-      <w:pPr>
-        <w:spacing w:before="100" w:beforeAutospacing="1" w:after="100" w:afterAutospacing="1" w:line="240" w:lineRule="auto"/>
-        <w:rPr>
-          <w:rFonts w:ascii="Times New Roman" w:eastAsia="Times New Roman" w:hAnsi="Times New Roman" w:cs="Times New Roman"/>
-          <w:sz w:val="28"/>
-          <w:szCs w:val="28"/>
-        </w:rPr>
-      </w:pPr>
-      <w:r>
-        <w:rPr>
-          <w:rFonts w:ascii="Times New Roman" w:eastAsia="Times New Roman" w:hAnsi="Times New Roman" w:cs="Times New Roman"/>
-          <w:sz w:val="28"/>
-          <w:szCs w:val="28"/>
-        </w:rPr>
-        <w:t>The project underwent a multi-stage development process. Initially, an Excel sheet was utilized for calculations; however, its limitations in handling complex computations prompted the transition to a Python-based desktop application. This application featured a simple GUI built with the CustomTkinter module. Subsequently, the project evolved into a web application leveraging frontend technologies such as HTML5, CSS3, and JavaScript. The final stage involved developing a React.js-based web app, incorporating TypeScript, Node.js,</w:t>
-      </w:r>
-      <w:r>
-        <w:rPr>
-          <w:rFonts w:ascii="Times New Roman" w:eastAsia="Times New Roman" w:hAnsi="Times New Roman" w:cs="Times New Roman"/>
-          <w:sz w:val="28"/>
-          <w:szCs w:val="28"/>
-        </w:rPr>
-        <w:t xml:space="preserve"> Express.js,</w:t>
-      </w:r>
-      <w:r>
-        <w:rPr>
-          <w:rFonts w:ascii="Times New Roman" w:eastAsia="Times New Roman" w:hAnsi="Times New Roman" w:cs="Times New Roman"/>
-          <w:sz w:val="28"/>
-          <w:szCs w:val="28"/>
-        </w:rPr>
-        <w:t xml:space="preserve"> PHP, Laravel, and MySQL to enhance flexibility and support modifications.</w:t>
-      </w:r>
-    </w:p>
-    <w:p>
-      <w:pPr>
-        <w:spacing w:before="100" w:beforeAutospacing="1" w:after="100" w:afterAutospacing="1" w:line="240" w:lineRule="auto"/>
-        <w:rPr>
-          <w:rFonts w:ascii="Times New Roman" w:eastAsia="Times New Roman" w:hAnsi="Times New Roman" w:cs="Times New Roman"/>
-          <w:sz w:val="24"/>
-          <w:szCs w:val="24"/>
-        </w:rPr>
-      </w:pPr>
-    </w:p>
-    <w:p>
-      <w:pPr>
-        <w:rPr>
-          <w:rFonts w:ascii="Times New Roman" w:hAnsi="Times New Roman" w:cs="Times New Roman"/>
-          <w:b/>
-          <w:bCs/>
-        </w:rPr>
-      </w:pPr>
-      <w:r>
-        <w:rPr>
-          <w:rFonts w:ascii="Times New Roman" w:hAnsi="Times New Roman" w:cs="Times New Roman"/>
-          <w:b/>
-          <w:bCs/>
-          <w:sz w:val="32"/>
-          <w:szCs w:val="32"/>
-        </w:rPr>
-        <w:t xml:space="preserve">Data Analysis: </w:t>
-      </w:r>
-    </w:p>
-    <w:p>
-      <w:pPr>
-        <w:spacing w:before="100" w:beforeAutospacing="1" w:after="100" w:afterAutospacing="1" w:line="240" w:lineRule="auto"/>
-        <w:rPr>
-          <w:rFonts w:ascii="Times New Roman" w:eastAsia="Times New Roman" w:hAnsi="Times New Roman" w:cs="Times New Roman"/>
-          <w:sz w:val="28"/>
-          <w:szCs w:val="28"/>
-        </w:rPr>
-      </w:pPr>
-      <w:r>
-        <w:rPr>
-          <w:rFonts w:ascii="Times New Roman" w:eastAsia="Times New Roman" w:hAnsi="Times New Roman" w:cs="Times New Roman"/>
-          <w:sz w:val="28"/>
-          <w:szCs w:val="28"/>
-        </w:rPr>
-        <w:t>Data collection was conducted via a survey form to evaluate user needs and preferences. The results indicated a strong demand for an efficient, accurate, and user-friendly application, which informed the development process and ensured alignment with user requirements.</w:t>
-      </w:r>
-    </w:p>
-    <w:p>
-      <w:pPr>
-        <w:spacing w:before="100" w:beforeAutospacing="1" w:after="100" w:afterAutospacing="1" w:line="240" w:lineRule="auto"/>
-        <w:rPr>
-          <w:rFonts w:ascii="Times New Roman" w:eastAsia="Times New Roman" w:hAnsi="Times New Roman" w:cs="Times New Roman"/>
-          <w:sz w:val="28"/>
-          <w:szCs w:val="28"/>
-        </w:rPr>
-      </w:pPr>
-      <w:r>
-        <w:rPr>
-          <w:rFonts w:ascii="Times New Roman" w:eastAsia="Times New Roman" w:hAnsi="Times New Roman" w:cs="Times New Roman"/>
-          <w:sz w:val="28"/>
-          <w:szCs w:val="28"/>
-        </w:rPr>
-        <w:lastRenderedPageBreak/>
-        <w:t>This tool represents a significant advancement in electrical engineering workflows, demonstrating its value and potential for broad adoption in industrial and academic settings.</w:t>
-      </w:r>
-    </w:p>
-    <w:p>
-      <w:pPr>
-        <w:spacing w:before="100" w:beforeAutospacing="1" w:after="100" w:afterAutospacing="1" w:line="240" w:lineRule="auto"/>
-        <w:rPr>
-          <w:rFonts w:ascii="Times New Roman" w:eastAsia="Times New Roman" w:hAnsi="Times New Roman" w:cs="Times New Roman"/>
-          <w:sz w:val="28"/>
-          <w:szCs w:val="28"/>
-        </w:rPr>
-      </w:pPr>
-    </w:p>
-    <w:p>
-      <w:pPr>
-        <w:spacing w:before="100" w:beforeAutospacing="1" w:after="100" w:afterAutospacing="1" w:line="240" w:lineRule="auto"/>
-        <w:rPr>
-          <w:rFonts w:ascii="Times New Roman" w:eastAsia="Times New Roman" w:hAnsi="Times New Roman" w:cs="Times New Roman"/>
-          <w:sz w:val="32"/>
-          <w:szCs w:val="32"/>
-        </w:rPr>
-      </w:pPr>
-      <w:r>
-        <w:rPr>
-          <w:rFonts w:ascii="Times New Roman" w:eastAsia="Times New Roman" w:hAnsi="Times New Roman" w:cs="Times New Roman"/>
-          <w:b/>
-          <w:bCs/>
-          <w:sz w:val="32"/>
-          <w:szCs w:val="32"/>
-        </w:rPr>
-        <w:t xml:space="preserve">References: </w:t>
-      </w:r>
-    </w:p>
-    <w:p>
-      <w:pPr>
         <w:numPr>
           <w:ilvl w:val="0"/>
-          <w:numId w:val="1"/>
+          <w:numId w:val="4"/>
         </w:numPr>
         <w:spacing w:before="100" w:beforeAutospacing="1" w:after="100" w:afterAutospacing="1" w:line="240" w:lineRule="auto"/>
         <w:rPr>
           <w:rFonts w:ascii="Times New Roman" w:eastAsia="Times New Roman" w:hAnsi="Times New Roman" w:cs="Times New Roman"/>
-          <w:sz w:val="28"/>
-          <w:szCs w:val="28"/>
-        </w:rPr>
-      </w:pPr>
-      <w:r>
-        <w:rPr>
-          <w:rFonts w:ascii="Times New Roman" w:eastAsia="Times New Roman" w:hAnsi="Times New Roman" w:cs="Times New Roman"/>
-          <w:sz w:val="28"/>
-          <w:szCs w:val="28"/>
-        </w:rPr>
-        <w:t>Power Factor Correction Solutions and Applications - IEEE Organization.</w:t>
+          <w:sz w:val="32"/>
+          <w:szCs w:val="32"/>
+        </w:rPr>
+      </w:pPr>
+      <w:r>
+        <w:rPr>
+          <w:rFonts w:ascii="Times New Roman" w:eastAsia="Times New Roman" w:hAnsi="Times New Roman" w:cs="Times New Roman"/>
+          <w:sz w:val="32"/>
+          <w:szCs w:val="32"/>
+        </w:rPr>
+        <w:t>Power Cables - Al-</w:t>
+      </w:r>
+      <w:proofErr w:type="spellStart"/>
+      <w:r>
+        <w:rPr>
+          <w:rFonts w:ascii="Times New Roman" w:eastAsia="Times New Roman" w:hAnsi="Times New Roman" w:cs="Times New Roman"/>
+          <w:sz w:val="32"/>
+          <w:szCs w:val="32"/>
+        </w:rPr>
+        <w:t>Suwaidi</w:t>
+      </w:r>
+      <w:proofErr w:type="spellEnd"/>
+      <w:r>
+        <w:rPr>
+          <w:rFonts w:ascii="Times New Roman" w:eastAsia="Times New Roman" w:hAnsi="Times New Roman" w:cs="Times New Roman"/>
+          <w:sz w:val="32"/>
+          <w:szCs w:val="32"/>
+        </w:rPr>
+        <w:t xml:space="preserve"> Catalogue.</w:t>
       </w:r>
     </w:p>
-    <w:p>
-      <w:pPr>
-        <w:numPr>
-          <w:ilvl w:val="0"/>
-          <w:numId w:val="1"/>
-        </w:numPr>
-        <w:spacing w:before="100" w:beforeAutospacing="1" w:after="100" w:afterAutospacing="1" w:line="240" w:lineRule="auto"/>
-        <w:rPr>
-          <w:rFonts w:ascii="Times New Roman" w:eastAsia="Times New Roman" w:hAnsi="Times New Roman" w:cs="Times New Roman"/>
-          <w:sz w:val="28"/>
-          <w:szCs w:val="28"/>
-        </w:rPr>
-      </w:pPr>
-      <w:r>
-        <w:rPr>
-          <w:rFonts w:ascii="Times New Roman" w:eastAsia="Times New Roman" w:hAnsi="Times New Roman" w:cs="Times New Roman"/>
-          <w:sz w:val="28"/>
-          <w:szCs w:val="28"/>
-        </w:rPr>
-        <w:t>Conversion of electrical units - Iowa State University Extension and Outreach.</w:t>
-      </w:r>
-    </w:p>
-    <w:p>
-      <w:pPr>
-        <w:numPr>
-          <w:ilvl w:val="0"/>
-          <w:numId w:val="1"/>
-        </w:numPr>
-        <w:spacing w:before="100" w:beforeAutospacing="1" w:after="100" w:afterAutospacing="1" w:line="240" w:lineRule="auto"/>
-        <w:rPr>
-          <w:rFonts w:ascii="Times New Roman" w:eastAsia="Times New Roman" w:hAnsi="Times New Roman" w:cs="Times New Roman"/>
-          <w:sz w:val="28"/>
-          <w:szCs w:val="28"/>
-        </w:rPr>
-      </w:pPr>
-      <w:r>
-        <w:rPr>
-          <w:rFonts w:ascii="Times New Roman" w:eastAsia="Times New Roman" w:hAnsi="Times New Roman" w:cs="Times New Roman"/>
-          <w:sz w:val="28"/>
-          <w:szCs w:val="28"/>
-        </w:rPr>
-        <w:t>Electricity and Magnetism Equation Sheet - The University of Texas at Dallas.</w:t>
-      </w:r>
-    </w:p>
-    <w:p>
-      <w:pPr>
-        <w:numPr>
-          <w:ilvl w:val="0"/>
-          <w:numId w:val="1"/>
-        </w:numPr>
-        <w:spacing w:before="100" w:beforeAutospacing="1" w:after="100" w:afterAutospacing="1" w:line="240" w:lineRule="auto"/>
-        <w:rPr>
-          <w:rFonts w:ascii="Times New Roman" w:eastAsia="Times New Roman" w:hAnsi="Times New Roman" w:cs="Times New Roman"/>
-          <w:sz w:val="28"/>
-          <w:szCs w:val="28"/>
-        </w:rPr>
-      </w:pPr>
-      <w:r>
-        <w:rPr>
-          <w:rFonts w:ascii="Times New Roman" w:eastAsia="Times New Roman" w:hAnsi="Times New Roman" w:cs="Times New Roman"/>
-          <w:sz w:val="28"/>
-          <w:szCs w:val="28"/>
-        </w:rPr>
-        <w:t>Power Cables - Al-</w:t>
-      </w:r>
-      <w:proofErr w:type="spellStart"/>
-      <w:r>
-        <w:rPr>
-          <w:rFonts w:ascii="Times New Roman" w:eastAsia="Times New Roman" w:hAnsi="Times New Roman" w:cs="Times New Roman"/>
-          <w:sz w:val="28"/>
-          <w:szCs w:val="28"/>
-        </w:rPr>
-        <w:t>Suwaidi</w:t>
-      </w:r>
-      <w:proofErr w:type="spellEnd"/>
-      <w:r>
-        <w:rPr>
-          <w:rFonts w:ascii="Times New Roman" w:eastAsia="Times New Roman" w:hAnsi="Times New Roman" w:cs="Times New Roman"/>
-          <w:sz w:val="28"/>
-          <w:szCs w:val="28"/>
-        </w:rPr>
-        <w:t xml:space="preserve"> Catalogue.</w:t>
-      </w:r>
-    </w:p>
-    <w:p/>
-    <w:bookmarkEnd w:id="0"/>
-    <w:p/>
     <w:sectPr>
       <w:pgSz w:w="12240" w:h="15840"/>
       <w:pgMar w:top="1440" w:right="1440" w:bottom="1440" w:left="1440" w:header="720" w:footer="720" w:gutter="0"/>
@@ -404,6 +382,119 @@
 <file path=word/numbering.xml><?xml version="1.0" encoding="utf-8"?>
 <w:numbering xmlns:wpc="http://schemas.microsoft.com/office/word/2010/wordprocessingCanvas" xmlns:cx="http://schemas.microsoft.com/office/drawing/2014/chartex" xmlns:mc="http://schemas.openxmlformats.org/markup-compatibility/2006" xmlns:o="urn:schemas-microsoft-com:office:office" xmlns:r="http://schemas.openxmlformats.org/officeDocument/2006/relationships" xmlns:m="http://schemas.openxmlformats.org/officeDocument/2006/math" xmlns:v="urn:schemas-microsoft-com:vml" xmlns:wp14="http://schemas.microsoft.com/office/word/2010/wordprocessingDrawing" xmlns:wp="http://schemas.openxmlformats.org/drawingml/2006/wordprocessingDrawing" xmlns:w10="urn:schemas-microsoft-com:office:word" xmlns:w="http://schemas.openxmlformats.org/wordprocessingml/2006/main" xmlns:w14="http://schemas.microsoft.com/office/word/2010/wordml" xmlns:w15="http://schemas.microsoft.com/office/word/2012/wordml" xmlns:w16se="http://schemas.microsoft.com/office/word/2015/wordml/symex" xmlns:wpg="http://schemas.microsoft.com/office/word/2010/wordprocessingGroup" xmlns:wpi="http://schemas.microsoft.com/office/word/2010/wordprocessingInk" xmlns:wne="http://schemas.microsoft.com/office/word/2006/wordml" xmlns:wps="http://schemas.microsoft.com/office/word/2010/wordprocessingShape" mc:Ignorable="w14 w15 w16se wp14">
   <w:abstractNum w:abstractNumId="0" w15:restartNumberingAfterBreak="0">
+    <w:nsid w:val="21BD7FEB"/>
+    <w:multiLevelType w:val="multilevel"/>
+    <w:tmpl w:val="813E87E4"/>
+    <w:lvl w:ilvl="0">
+      <w:start w:val="1"/>
+      <w:numFmt w:val="decimal"/>
+      <w:lvlText w:val="%1."/>
+      <w:lvlJc w:val="left"/>
+      <w:pPr>
+        <w:tabs>
+          <w:tab w:val="num" w:pos="720"/>
+        </w:tabs>
+        <w:ind w:left="720" w:hanging="360"/>
+      </w:pPr>
+    </w:lvl>
+    <w:lvl w:ilvl="1" w:tentative="1">
+      <w:start w:val="1"/>
+      <w:numFmt w:val="decimal"/>
+      <w:lvlText w:val="%2."/>
+      <w:lvlJc w:val="left"/>
+      <w:pPr>
+        <w:tabs>
+          <w:tab w:val="num" w:pos="1440"/>
+        </w:tabs>
+        <w:ind w:left="1440" w:hanging="360"/>
+      </w:pPr>
+    </w:lvl>
+    <w:lvl w:ilvl="2" w:tentative="1">
+      <w:start w:val="1"/>
+      <w:numFmt w:val="decimal"/>
+      <w:lvlText w:val="%3."/>
+      <w:lvlJc w:val="left"/>
+      <w:pPr>
+        <w:tabs>
+          <w:tab w:val="num" w:pos="2160"/>
+        </w:tabs>
+        <w:ind w:left="2160" w:hanging="360"/>
+      </w:pPr>
+    </w:lvl>
+    <w:lvl w:ilvl="3" w:tentative="1">
+      <w:start w:val="1"/>
+      <w:numFmt w:val="decimal"/>
+      <w:lvlText w:val="%4."/>
+      <w:lvlJc w:val="left"/>
+      <w:pPr>
+        <w:tabs>
+          <w:tab w:val="num" w:pos="2880"/>
+        </w:tabs>
+        <w:ind w:left="2880" w:hanging="360"/>
+      </w:pPr>
+    </w:lvl>
+    <w:lvl w:ilvl="4" w:tentative="1">
+      <w:start w:val="1"/>
+      <w:numFmt w:val="decimal"/>
+      <w:lvlText w:val="%5."/>
+      <w:lvlJc w:val="left"/>
+      <w:pPr>
+        <w:tabs>
+          <w:tab w:val="num" w:pos="3600"/>
+        </w:tabs>
+        <w:ind w:left="3600" w:hanging="360"/>
+      </w:pPr>
+    </w:lvl>
+    <w:lvl w:ilvl="5" w:tentative="1">
+      <w:start w:val="1"/>
+      <w:numFmt w:val="decimal"/>
+      <w:lvlText w:val="%6."/>
+      <w:lvlJc w:val="left"/>
+      <w:pPr>
+        <w:tabs>
+          <w:tab w:val="num" w:pos="4320"/>
+        </w:tabs>
+        <w:ind w:left="4320" w:hanging="360"/>
+      </w:pPr>
+    </w:lvl>
+    <w:lvl w:ilvl="6" w:tentative="1">
+      <w:start w:val="1"/>
+      <w:numFmt w:val="decimal"/>
+      <w:lvlText w:val="%7."/>
+      <w:lvlJc w:val="left"/>
+      <w:pPr>
+        <w:tabs>
+          <w:tab w:val="num" w:pos="5040"/>
+        </w:tabs>
+        <w:ind w:left="5040" w:hanging="360"/>
+      </w:pPr>
+    </w:lvl>
+    <w:lvl w:ilvl="7" w:tentative="1">
+      <w:start w:val="1"/>
+      <w:numFmt w:val="decimal"/>
+      <w:lvlText w:val="%8."/>
+      <w:lvlJc w:val="left"/>
+      <w:pPr>
+        <w:tabs>
+          <w:tab w:val="num" w:pos="5760"/>
+        </w:tabs>
+        <w:ind w:left="5760" w:hanging="360"/>
+      </w:pPr>
+    </w:lvl>
+    <w:lvl w:ilvl="8" w:tentative="1">
+      <w:start w:val="1"/>
+      <w:numFmt w:val="decimal"/>
+      <w:lvlText w:val="%9."/>
+      <w:lvlJc w:val="left"/>
+      <w:pPr>
+        <w:tabs>
+          <w:tab w:val="num" w:pos="6480"/>
+        </w:tabs>
+        <w:ind w:left="6480" w:hanging="360"/>
+      </w:pPr>
+    </w:lvl>
+  </w:abstractNum>
+  <w:abstractNum w:abstractNumId="1" w15:restartNumberingAfterBreak="0">
     <w:nsid w:val="48941A79"/>
     <w:multiLevelType w:val="multilevel"/>
     <w:tmpl w:val="A8CE500E"/>
@@ -516,7 +607,242 @@
       </w:pPr>
     </w:lvl>
   </w:abstractNum>
+  <w:abstractNum w:abstractNumId="2" w15:restartNumberingAfterBreak="0">
+    <w:nsid w:val="5F6C7089"/>
+    <w:multiLevelType w:val="multilevel"/>
+    <w:tmpl w:val="01EAD662"/>
+    <w:lvl w:ilvl="0">
+      <w:start w:val="1"/>
+      <w:numFmt w:val="decimal"/>
+      <w:lvlText w:val="%1."/>
+      <w:lvlJc w:val="left"/>
+      <w:pPr>
+        <w:tabs>
+          <w:tab w:val="num" w:pos="720"/>
+        </w:tabs>
+        <w:ind w:left="720" w:hanging="360"/>
+      </w:pPr>
+    </w:lvl>
+    <w:lvl w:ilvl="1" w:tentative="1">
+      <w:start w:val="1"/>
+      <w:numFmt w:val="decimal"/>
+      <w:lvlText w:val="%2."/>
+      <w:lvlJc w:val="left"/>
+      <w:pPr>
+        <w:tabs>
+          <w:tab w:val="num" w:pos="1440"/>
+        </w:tabs>
+        <w:ind w:left="1440" w:hanging="360"/>
+      </w:pPr>
+    </w:lvl>
+    <w:lvl w:ilvl="2" w:tentative="1">
+      <w:start w:val="1"/>
+      <w:numFmt w:val="decimal"/>
+      <w:lvlText w:val="%3."/>
+      <w:lvlJc w:val="left"/>
+      <w:pPr>
+        <w:tabs>
+          <w:tab w:val="num" w:pos="2160"/>
+        </w:tabs>
+        <w:ind w:left="2160" w:hanging="360"/>
+      </w:pPr>
+    </w:lvl>
+    <w:lvl w:ilvl="3" w:tentative="1">
+      <w:start w:val="1"/>
+      <w:numFmt w:val="decimal"/>
+      <w:lvlText w:val="%4."/>
+      <w:lvlJc w:val="left"/>
+      <w:pPr>
+        <w:tabs>
+          <w:tab w:val="num" w:pos="2880"/>
+        </w:tabs>
+        <w:ind w:left="2880" w:hanging="360"/>
+      </w:pPr>
+    </w:lvl>
+    <w:lvl w:ilvl="4" w:tentative="1">
+      <w:start w:val="1"/>
+      <w:numFmt w:val="decimal"/>
+      <w:lvlText w:val="%5."/>
+      <w:lvlJc w:val="left"/>
+      <w:pPr>
+        <w:tabs>
+          <w:tab w:val="num" w:pos="3600"/>
+        </w:tabs>
+        <w:ind w:left="3600" w:hanging="360"/>
+      </w:pPr>
+    </w:lvl>
+    <w:lvl w:ilvl="5" w:tentative="1">
+      <w:start w:val="1"/>
+      <w:numFmt w:val="decimal"/>
+      <w:lvlText w:val="%6."/>
+      <w:lvlJc w:val="left"/>
+      <w:pPr>
+        <w:tabs>
+          <w:tab w:val="num" w:pos="4320"/>
+        </w:tabs>
+        <w:ind w:left="4320" w:hanging="360"/>
+      </w:pPr>
+    </w:lvl>
+    <w:lvl w:ilvl="6" w:tentative="1">
+      <w:start w:val="1"/>
+      <w:numFmt w:val="decimal"/>
+      <w:lvlText w:val="%7."/>
+      <w:lvlJc w:val="left"/>
+      <w:pPr>
+        <w:tabs>
+          <w:tab w:val="num" w:pos="5040"/>
+        </w:tabs>
+        <w:ind w:left="5040" w:hanging="360"/>
+      </w:pPr>
+    </w:lvl>
+    <w:lvl w:ilvl="7" w:tentative="1">
+      <w:start w:val="1"/>
+      <w:numFmt w:val="decimal"/>
+      <w:lvlText w:val="%8."/>
+      <w:lvlJc w:val="left"/>
+      <w:pPr>
+        <w:tabs>
+          <w:tab w:val="num" w:pos="5760"/>
+        </w:tabs>
+        <w:ind w:left="5760" w:hanging="360"/>
+      </w:pPr>
+    </w:lvl>
+    <w:lvl w:ilvl="8" w:tentative="1">
+      <w:start w:val="1"/>
+      <w:numFmt w:val="decimal"/>
+      <w:lvlText w:val="%9."/>
+      <w:lvlJc w:val="left"/>
+      <w:pPr>
+        <w:tabs>
+          <w:tab w:val="num" w:pos="6480"/>
+        </w:tabs>
+        <w:ind w:left="6480" w:hanging="360"/>
+      </w:pPr>
+    </w:lvl>
+  </w:abstractNum>
+  <w:abstractNum w:abstractNumId="3" w15:restartNumberingAfterBreak="0">
+    <w:nsid w:val="72515CC1"/>
+    <w:multiLevelType w:val="multilevel"/>
+    <w:tmpl w:val="5A46963A"/>
+    <w:lvl w:ilvl="0">
+      <w:start w:val="1"/>
+      <w:numFmt w:val="decimal"/>
+      <w:lvlText w:val="%1."/>
+      <w:lvlJc w:val="left"/>
+      <w:pPr>
+        <w:tabs>
+          <w:tab w:val="num" w:pos="720"/>
+        </w:tabs>
+        <w:ind w:left="720" w:hanging="360"/>
+      </w:pPr>
+    </w:lvl>
+    <w:lvl w:ilvl="1" w:tentative="1">
+      <w:start w:val="1"/>
+      <w:numFmt w:val="decimal"/>
+      <w:lvlText w:val="%2."/>
+      <w:lvlJc w:val="left"/>
+      <w:pPr>
+        <w:tabs>
+          <w:tab w:val="num" w:pos="1440"/>
+        </w:tabs>
+        <w:ind w:left="1440" w:hanging="360"/>
+      </w:pPr>
+    </w:lvl>
+    <w:lvl w:ilvl="2" w:tentative="1">
+      <w:start w:val="1"/>
+      <w:numFmt w:val="decimal"/>
+      <w:lvlText w:val="%3."/>
+      <w:lvlJc w:val="left"/>
+      <w:pPr>
+        <w:tabs>
+          <w:tab w:val="num" w:pos="2160"/>
+        </w:tabs>
+        <w:ind w:left="2160" w:hanging="360"/>
+      </w:pPr>
+    </w:lvl>
+    <w:lvl w:ilvl="3" w:tentative="1">
+      <w:start w:val="1"/>
+      <w:numFmt w:val="decimal"/>
+      <w:lvlText w:val="%4."/>
+      <w:lvlJc w:val="left"/>
+      <w:pPr>
+        <w:tabs>
+          <w:tab w:val="num" w:pos="2880"/>
+        </w:tabs>
+        <w:ind w:left="2880" w:hanging="360"/>
+      </w:pPr>
+    </w:lvl>
+    <w:lvl w:ilvl="4" w:tentative="1">
+      <w:start w:val="1"/>
+      <w:numFmt w:val="decimal"/>
+      <w:lvlText w:val="%5."/>
+      <w:lvlJc w:val="left"/>
+      <w:pPr>
+        <w:tabs>
+          <w:tab w:val="num" w:pos="3600"/>
+        </w:tabs>
+        <w:ind w:left="3600" w:hanging="360"/>
+      </w:pPr>
+    </w:lvl>
+    <w:lvl w:ilvl="5" w:tentative="1">
+      <w:start w:val="1"/>
+      <w:numFmt w:val="decimal"/>
+      <w:lvlText w:val="%6."/>
+      <w:lvlJc w:val="left"/>
+      <w:pPr>
+        <w:tabs>
+          <w:tab w:val="num" w:pos="4320"/>
+        </w:tabs>
+        <w:ind w:left="4320" w:hanging="360"/>
+      </w:pPr>
+    </w:lvl>
+    <w:lvl w:ilvl="6" w:tentative="1">
+      <w:start w:val="1"/>
+      <w:numFmt w:val="decimal"/>
+      <w:lvlText w:val="%7."/>
+      <w:lvlJc w:val="left"/>
+      <w:pPr>
+        <w:tabs>
+          <w:tab w:val="num" w:pos="5040"/>
+        </w:tabs>
+        <w:ind w:left="5040" w:hanging="360"/>
+      </w:pPr>
+    </w:lvl>
+    <w:lvl w:ilvl="7" w:tentative="1">
+      <w:start w:val="1"/>
+      <w:numFmt w:val="decimal"/>
+      <w:lvlText w:val="%8."/>
+      <w:lvlJc w:val="left"/>
+      <w:pPr>
+        <w:tabs>
+          <w:tab w:val="num" w:pos="5760"/>
+        </w:tabs>
+        <w:ind w:left="5760" w:hanging="360"/>
+      </w:pPr>
+    </w:lvl>
+    <w:lvl w:ilvl="8" w:tentative="1">
+      <w:start w:val="1"/>
+      <w:numFmt w:val="decimal"/>
+      <w:lvlText w:val="%9."/>
+      <w:lvlJc w:val="left"/>
+      <w:pPr>
+        <w:tabs>
+          <w:tab w:val="num" w:pos="6480"/>
+        </w:tabs>
+        <w:ind w:left="6480" w:hanging="360"/>
+      </w:pPr>
+    </w:lvl>
+  </w:abstractNum>
   <w:num w:numId="1">
+    <w:abstractNumId w:val="1"/>
+  </w:num>
+  <w:num w:numId="2">
+    <w:abstractNumId w:val="2"/>
+  </w:num>
+  <w:num w:numId="3">
+    <w:abstractNumId w:val="3"/>
+  </w:num>
+  <w:num w:numId="4">
     <w:abstractNumId w:val="0"/>
   </w:num>
 </w:numbering>
@@ -1004,6 +1330,17 @@
       <w:bCs/>
     </w:rPr>
   </w:style>
+  <w:style w:type="character" w:styleId="Emphasis">
+    <w:name w:val="Emphasis"/>
+    <w:basedOn w:val="DefaultParagraphFont"/>
+    <w:uiPriority w:val="20"/>
+    <w:qFormat/>
+    <w:rsid w:val="00957703"/>
+    <w:rPr>
+      <w:i/>
+      <w:iCs/>
+    </w:rPr>
+  </w:style>
 </w:styles>
 </file>
 

</xml_diff>

<commit_message>
BASEF 1st Round Commit
</commit_message>
<xml_diff>
--- a/Documents/WattWizards - ISEF 2025 - Abstract.docx
+++ b/Documents/WattWizards - ISEF 2025 - Abstract.docx
@@ -172,13 +172,6 @@
           <w:szCs w:val="32"/>
         </w:rPr>
         <w:br/>
-      </w:r>
-      <w:r>
-        <w:rPr>
-          <w:rFonts w:ascii="Times New Roman" w:eastAsia="Times New Roman" w:hAnsi="Times New Roman" w:cs="Times New Roman"/>
-          <w:sz w:val="32"/>
-          <w:szCs w:val="32"/>
-        </w:rPr>
         <w:t>The development of WattWizards followed a structured multi-phase approach. Initially, an Excel-based tool was employed but proved inadequate for complex tasks, prompting the creation of a Python desktop application with a GUI using CustomTkinter. To improve scalability and user accessibility, the project transitioned to a web application utilizing Html5, Css3, and JavaScript.</w:t>
       </w:r>
     </w:p>
@@ -199,8 +192,6 @@
         </w:rPr>
         <w:t>The final iteration was developed as a React.js platform integrated with Node.js, Express.js, PHP, and Laravel for microservices and backend improvements. MySQL ensured efficient data handling.</w:t>
       </w:r>
-      <w:bookmarkStart w:id="0" w:name="_GoBack"/>
-      <w:bookmarkEnd w:id="0"/>
     </w:p>
     <w:p>
       <w:pPr>
@@ -338,13 +329,18 @@
         <w:spacing w:before="100" w:beforeAutospacing="1" w:after="100" w:afterAutospacing="1" w:line="240" w:lineRule="auto"/>
         <w:rPr>
           <w:rFonts w:ascii="Times New Roman" w:eastAsia="Times New Roman" w:hAnsi="Times New Roman" w:cs="Times New Roman"/>
-          <w:sz w:val="32"/>
-          <w:szCs w:val="32"/>
-        </w:rPr>
-      </w:pPr>
-      <w:r>
-        <w:rPr>
-          <w:rFonts w:ascii="Times New Roman" w:eastAsia="Times New Roman" w:hAnsi="Times New Roman" w:cs="Times New Roman"/>
+          <w:b/>
+          <w:bCs/>
+          <w:sz w:val="32"/>
+          <w:szCs w:val="32"/>
+        </w:rPr>
+      </w:pPr>
+      <w:bookmarkStart w:id="0" w:name="_GoBack"/>
+      <w:r>
+        <w:rPr>
+          <w:rFonts w:ascii="Times New Roman" w:eastAsia="Times New Roman" w:hAnsi="Times New Roman" w:cs="Times New Roman"/>
+          <w:b/>
+          <w:bCs/>
           <w:sz w:val="32"/>
           <w:szCs w:val="32"/>
         </w:rPr>
@@ -354,6 +350,8 @@
       <w:r>
         <w:rPr>
           <w:rFonts w:ascii="Times New Roman" w:eastAsia="Times New Roman" w:hAnsi="Times New Roman" w:cs="Times New Roman"/>
+          <w:b/>
+          <w:bCs/>
           <w:sz w:val="32"/>
           <w:szCs w:val="32"/>
         </w:rPr>
@@ -363,11 +361,14 @@
       <w:r>
         <w:rPr>
           <w:rFonts w:ascii="Times New Roman" w:eastAsia="Times New Roman" w:hAnsi="Times New Roman" w:cs="Times New Roman"/>
+          <w:b/>
+          <w:bCs/>
           <w:sz w:val="32"/>
           <w:szCs w:val="32"/>
         </w:rPr>
         <w:t xml:space="preserve"> Catalogue.</w:t>
       </w:r>
+      <w:bookmarkEnd w:id="0"/>
     </w:p>
     <w:sectPr>
       <w:pgSz w:w="12240" w:h="15840"/>

</xml_diff>